<commit_message>
Figure-led 5-page version: 13 figures, 3 tables, concise text
Co-Authored-By: Claude Opus 5.5 <noreply@anthropic.com>
Claude-Session: https://claude.ai/code/session_019mQSSZrr74cbeDdr3V2xBg
</commit_message>
<xml_diff>
--- a/ncue-pv-inverter-uncertainty/paper_rev/Response_to_review.docx
+++ b/ncue-pv-inverter-uncertainty/paper_rev/Response_to_review.docx
@@ -70,7 +70,7 @@
           <w:sz w:val="21"/>
           <w:szCs w:val="21"/>
         </w:rPr>
-        <w:t xml:space="preserve">Two new figures (plant/measurement layout; three-phase waveforms), two new tables (structure vs efficiency; error metrics), a converged Sobol analysis with confidence intervals, a complete lower-bound stack, an aliasing test and a long-term check against the inverter energy counters. Two conclusions changed: the budget can reach the clear-day measurement, but only at an implausible joint extreme; and over 3.5 years the counters agree with the model within 3%, so the clear-day shortfall is not a permanent plant loss. To keep six pages, the model-chain diagram, the monthly ERA5 chart, the hourly-ratio chart, the per-record chart and the single-change table were removed; their key numbers remain in the text.</w:t>
+        <w:t xml:space="preserve">The paper is now led by figures (13 figures, 3 tables, 5 pages). New: plant/measurement layout, three-phase waveforms, aliasing test, compact model chain, Sobol convergence, inverter structure vs efficiency, and clear days vs 3.5-year counters; new tables: factor ranges with confidence intervals and error metrics. Two conclusions changed: the budget reaches the clear-day measurement only at an implausible joint extreme, and over 3.5 years the inverter counters agree with the model within 3%, so the clear-day shortfall is not a permanent plant loss.</w:t>
       </w:r>
     </w:p>
     <w:tbl>
@@ -328,7 +328,7 @@
                 <w:sz w:val="19"/>
                 <w:szCs w:val="19"/>
               </w:rPr>
-              <w:t xml:space="preserve">Abstract; 4.5; 5; 6</w:t>
+              <w:t xml:space="preserve">Abstract; 4.5; Fig. 13; 5; 6</w:t>
             </w:r>
           </w:p>
         </w:tc>
@@ -550,7 +550,7 @@
                 <w:sz w:val="19"/>
                 <w:szCs w:val="19"/>
               </w:rPr>
-              <w:t xml:space="preserve">Aliasing: explained why the mean power is preserved (samples at five equally spaced phases; whole-cycle intervals avoided) and tested with 400 synthetic minutes built from the measured unbalance, displacement and harmonics. Max error 0.06% (10 ms) and 0.05% (20 ms); 0.12% and 0.12% even at exactly 60 Hz; 200 ms would err by up to 12%.</w:t>
+              <w:t xml:space="preserve">Aliasing (new Fig. 3): explained why the mean power is preserved (samples at five equally spaced phases; whole-cycle intervals avoided) and tested with 400 synthetic minutes built from the measured unbalance, displacement and harmonics. Max error 0.06% (10 ms) and 0.05% (20 ms); 0.12% and 0.12% even at exactly 60 Hz; 200 ms would err by up to 12%.</w:t>
             </w:r>
           </w:p>
           <w:p>
@@ -598,7 +598,7 @@
                 <w:sz w:val="19"/>
                 <w:szCs w:val="19"/>
               </w:rPr>
-              <w:t xml:space="preserve">Fig. 1; Fig. 2; 2.3</w:t>
+              <w:t xml:space="preserve">Fig. 1; Fig. 2; Fig. 3; 2.3</w:t>
             </w:r>
           </w:p>
         </w:tc>
@@ -685,7 +685,7 @@
                 <w:sz w:val="19"/>
                 <w:szCs w:val="19"/>
               </w:rPr>
-              <w:t xml:space="preserve">Convergence: base samples raised from 1,024 to 4,096 (45,056 runs) plus five extra scrambling seeds. Total indices change by at most 0.003 (±5%) and 0.003 (±10%); seed-to-seed SD ≤ 0.002; top-five ranking stable from 64 samples. Table 2 reports S_T with 95% bootstrap confidence intervals; the last four factors have indices below 0.005 and are not ranked.</w:t>
+              <w:t xml:space="preserve">Convergence (new Fig. 5b): base samples raised from 1,024 to 4,096 (45,056 runs) plus five extra scrambling seeds. Total indices change by at most 0.003 (±5%) and 0.003 (±10%); seed-to-seed SD ≤ 0.002; top-five ranking stable from 64 samples. Table 2 reports S_T with 95% bootstrap confidence intervals; the last four factors have indices below 0.005 and are not ranked.</w:t>
             </w:r>
           </w:p>
         </w:tc>
@@ -718,7 +718,7 @@
                 <w:sz w:val="19"/>
                 <w:szCs w:val="19"/>
               </w:rPr>
-              <w:t xml:space="preserve">3.1; 3.2; Table 2</w:t>
+              <w:t xml:space="preserve">3 and 3.1; Table 2; Fig. 5</w:t>
             </w:r>
           </w:p>
         </w:tc>
@@ -790,7 +790,7 @@
                 <w:sz w:val="19"/>
                 <w:szCs w:val="19"/>
               </w:rPr>
-              <w:t xml:space="preserve">New Section 3.3 and Table 3. Same η: constant vs PVWatts differ by 0.36–0.37%; same peak efficiency: 0.6%; changing η from 0.985 to 0.96 within PVWatts: −2.6%. So the inverter effect in the budget is an efficiency assumption, not a structural one. On the clear October days the two structures with equal η differ by &lt; 0.1%.</w:t>
+              <w:t xml:space="preserve">New Section 3.2 and Fig. 6. Same η: constant vs PVWatts differ by 0.36–0.37%; same peak efficiency: 0.6%; changing η from 0.985 to 0.96 within PVWatts: −2.6%. So the inverter effect in the budget is an efficiency assumption, not a structural one. On the clear October days the two structures with equal η differ by &lt; 0.1%.</w:t>
             </w:r>
           </w:p>
         </w:tc>
@@ -823,7 +823,7 @@
                 <w:sz w:val="19"/>
                 <w:szCs w:val="19"/>
               </w:rPr>
-              <w:t xml:space="preserve">3.3; Table 3; Abstract; 6</w:t>
+              <w:t xml:space="preserve">3.2; Fig. 6; Abstract; 6</w:t>
             </w:r>
           </w:p>
         </w:tc>
@@ -895,7 +895,7 @@
                 <w:sz w:val="19"/>
                 <w:szCs w:val="19"/>
               </w:rPr>
-              <w:t xml:space="preserve">The reviewer is right: the earlier stack left out isotropic transposition (−3.9%) and Boland decomposition (−1.0%). Both are now included (Fig. 6; single effects given in the text). With every lower end the model reaches 82.0% of baseline, i.e. the measurement (81%) is reached.</w:t>
+              <w:t xml:space="preserve">The reviewer is right: the earlier stack left out isotropic transposition (−3.9%) and Boland decomposition (−1.0%). Both are now included (Fig. 12; single effects given in the text). With every lower end the model reaches 82.0% of baseline, i.e. the measurement (81%) is reached.</w:t>
             </w:r>
           </w:p>
           <w:p>
@@ -943,7 +943,7 @@
                 <w:sz w:val="19"/>
                 <w:szCs w:val="19"/>
               </w:rPr>
-              <w:t xml:space="preserve">4.4; Fig. 5; Fig. 6</w:t>
+              <w:t xml:space="preserve">4.4; Fig. 9; Fig. 12</w:t>
             </w:r>
           </w:p>
         </w:tc>
@@ -1015,7 +1015,7 @@
                 <w:sz w:val="19"/>
                 <w:szCs w:val="19"/>
               </w:rPr>
-              <w:t xml:space="preserve">Agreed and stated directly: correlation shows only the shape; the level is wrong. The ratio is now defined explicitly as R = ΣP_actual / ΣP_model (Eq. 4). Table 4 now gives MBE, nMBE, RMSE, nRMSE and r for all five clear-sky records (nMBE +23% and +24%, nRMSE 27% and 31% in October).</w:t>
+              <w:t xml:space="preserve">Agreed and stated directly: correlation shows only the shape; the level is wrong. The ratio is now defined explicitly as R = ΣP_actual / ΣP_model (Eq. 4). Table 3 now gives MBE, nMBE, RMSE, nRMSE and r for all five clear-sky records (nMBE +23% and +24%, nRMSE 27% and 31% in October).</w:t>
             </w:r>
           </w:p>
           <w:p>
@@ -1063,7 +1063,7 @@
                 <w:sz w:val="19"/>
                 <w:szCs w:val="19"/>
               </w:rPr>
-              <w:t xml:space="preserve">4.2 (Eq. 4); 4.3; Table 4; 5; 6</w:t>
+              <w:t xml:space="preserve">4.2 (Eq. 4); Table 3; Fig. 10; 5; 6</w:t>
             </w:r>
           </w:p>
         </w:tc>

</xml_diff>

<commit_message>
Final 6-page figure-led version: 12 figures, column-width Table 2, 30 kW counter shown as faulty
Co-Authored-By: Claude Opus 5.5 <noreply@anthropic.com>
Claude-Session: https://claude.ai/code/session_019mQSSZrr74cbeDdr3V2xBg
</commit_message>
<xml_diff>
--- a/ncue-pv-inverter-uncertainty/paper_rev/Response_to_review.docx
+++ b/ncue-pv-inverter-uncertainty/paper_rev/Response_to_review.docx
@@ -70,7 +70,7 @@
           <w:sz w:val="21"/>
           <w:szCs w:val="21"/>
         </w:rPr>
-        <w:t xml:space="preserve">The paper is now led by figures (13 figures, 3 tables, 5 pages). New: plant/measurement layout, three-phase waveforms, aliasing test, compact model chain, Sobol convergence, inverter structure vs efficiency, and clear days vs 3.5-year counters; new tables: factor ranges with confidence intervals and error metrics. Two conclusions changed: the budget reaches the clear-day measurement only at an implausible joint extreme, and over 3.5 years the inverter counters agree with the model within 3%, so the clear-day shortfall is not a permanent plant loss.</w:t>
+        <w:t xml:space="preserve">The paper is now led by figures (12 figures, 3 tables, 6 pages). New: plant/measurement layout, three-phase waveforms, compact model chain, one-at-a-time chart with converged Sobol indices, inverter structure vs efficiency, and clear days vs 3.5-year counters (the 30 kW counter is faulty and shown as such); new tables: factor ranges with confidence intervals and error metrics. Two conclusions changed: the budget reaches the clear-day measurement only at an implausible joint extreme, and over 3.5 years the inverter counters agree with the model within 3%, so the clear-day shortfall is not a permanent plant loss.</w:t>
       </w:r>
     </w:p>
     <w:tbl>
@@ -328,7 +328,7 @@
                 <w:sz w:val="19"/>
                 <w:szCs w:val="19"/>
               </w:rPr>
-              <w:t xml:space="preserve">Abstract; 4.5; Fig. 13; 5; 6</w:t>
+              <w:t xml:space="preserve">Abstract; 4.5; Fig. 12; 5; 6</w:t>
             </w:r>
           </w:p>
         </w:tc>
@@ -550,7 +550,7 @@
                 <w:sz w:val="19"/>
                 <w:szCs w:val="19"/>
               </w:rPr>
-              <w:t xml:space="preserve">Aliasing (new Fig. 3): explained why the mean power is preserved (samples at five equally spaced phases; whole-cycle intervals avoided) and tested with 400 synthetic minutes built from the measured unbalance, displacement and harmonics. Max error 0.06% (10 ms) and 0.05% (20 ms); 0.12% and 0.12% even at exactly 60 Hz; 200 ms would err by up to 12%.</w:t>
+              <w:t xml:space="preserve">Aliasing (Section 2.3): explained why the mean power is preserved (samples at five equally spaced phases; whole-cycle intervals avoided) and tested with 400 synthetic minutes built from the measured unbalance, displacement and harmonics. Max error 0.06% (10 ms) and 0.05% (20 ms); 0.12% and 0.12% even at exactly 60 Hz; 200 ms would err by up to 12%.</w:t>
             </w:r>
           </w:p>
           <w:p>
@@ -598,7 +598,7 @@
                 <w:sz w:val="19"/>
                 <w:szCs w:val="19"/>
               </w:rPr>
-              <w:t xml:space="preserve">Fig. 1; Fig. 2; Fig. 3; 2.3</w:t>
+              <w:t xml:space="preserve">Fig. 1; Fig. 2; 2.3</w:t>
             </w:r>
           </w:p>
         </w:tc>
@@ -685,7 +685,7 @@
                 <w:sz w:val="19"/>
                 <w:szCs w:val="19"/>
               </w:rPr>
-              <w:t xml:space="preserve">Convergence (new Fig. 5b): base samples raised from 1,024 to 4,096 (45,056 runs) plus five extra scrambling seeds. Total indices change by at most 0.003 (±5%) and 0.003 (±10%); seed-to-seed SD ≤ 0.002; top-five ranking stable from 64 samples. Table 2 reports S_T with 95% bootstrap confidence intervals; the last four factors have indices below 0.005 and are not ranked.</w:t>
+              <w:t xml:space="preserve">Convergence (Section 3.1): base samples raised from 1,024 to 4,096 (45,056 runs) plus five extra scrambling seeds. Total indices change by at most 0.003 (±5%) and 0.003 (±10%); seed-to-seed SD ≤ 0.002; top-five ranking stable from 64 samples. Table 2 reports S_T with 95% bootstrap confidence intervals; the last four factors have indices below 0.005 and are not ranked.</w:t>
             </w:r>
           </w:p>
         </w:tc>
@@ -718,7 +718,7 @@
                 <w:sz w:val="19"/>
                 <w:szCs w:val="19"/>
               </w:rPr>
-              <w:t xml:space="preserve">3 and 3.1; Table 2; Fig. 5</w:t>
+              <w:t xml:space="preserve">3 and 3.1; Table 2; Fig. 4</w:t>
             </w:r>
           </w:p>
         </w:tc>
@@ -790,7 +790,7 @@
                 <w:sz w:val="19"/>
                 <w:szCs w:val="19"/>
               </w:rPr>
-              <w:t xml:space="preserve">New Section 3.2 and Fig. 6. Same η: constant vs PVWatts differ by 0.36–0.37%; same peak efficiency: 0.6%; changing η from 0.985 to 0.96 within PVWatts: −2.6%. So the inverter effect in the budget is an efficiency assumption, not a structural one. On the clear October days the two structures with equal η differ by &lt; 0.1%.</w:t>
+              <w:t xml:space="preserve">New Section 3.2 and Fig. 5. Same η: constant vs PVWatts differ by 0.36–0.37%; same peak efficiency: 0.6%; changing η from 0.985 to 0.96 within PVWatts: −2.6%. So the inverter effect in the budget is an efficiency assumption, not a structural one. On the clear October days the two structures with equal η differ by &lt; 0.1%.</w:t>
             </w:r>
           </w:p>
         </w:tc>
@@ -823,7 +823,7 @@
                 <w:sz w:val="19"/>
                 <w:szCs w:val="19"/>
               </w:rPr>
-              <w:t xml:space="preserve">3.2; Fig. 6; Abstract; 6</w:t>
+              <w:t xml:space="preserve">3.2; Fig. 5; Abstract; 6</w:t>
             </w:r>
           </w:p>
         </w:tc>
@@ -895,7 +895,7 @@
                 <w:sz w:val="19"/>
                 <w:szCs w:val="19"/>
               </w:rPr>
-              <w:t xml:space="preserve">The reviewer is right: the earlier stack left out isotropic transposition (−3.9%) and Boland decomposition (−1.0%). Both are now included (Fig. 12; single effects given in the text). With every lower end the model reaches 82.0% of baseline, i.e. the measurement (81%) is reached.</w:t>
+              <w:t xml:space="preserve">The reviewer is right: the earlier stack left out isotropic transposition (−3.9%) and Boland decomposition (−1.0%). Both are now included (Fig. 11; single effects given in the text). With every lower end the model reaches 82.0% of baseline, i.e. the measurement (81%) is reached.</w:t>
             </w:r>
           </w:p>
           <w:p>
@@ -943,7 +943,7 @@
                 <w:sz w:val="19"/>
                 <w:szCs w:val="19"/>
               </w:rPr>
-              <w:t xml:space="preserve">4.4; Fig. 9; Fig. 12</w:t>
+              <w:t xml:space="preserve">4.4; Fig. 8; Fig. 11</w:t>
             </w:r>
           </w:p>
         </w:tc>
@@ -1063,7 +1063,7 @@
                 <w:sz w:val="19"/>
                 <w:szCs w:val="19"/>
               </w:rPr>
-              <w:t xml:space="preserve">4.2 (Eq. 4); Table 3; Fig. 10; 5; 6</w:t>
+              <w:t xml:space="preserve">4.2 (Eq. 4); 4.3; Table 3; Fig. 9; 5; 6</w:t>
             </w:r>
           </w:p>
         </w:tc>

</xml_diff>